<commit_message>
docs: simplify member responsibilities and Word page numbering
</commit_message>
<xml_diff>
--- a/PaperPilot_项目文档.docx
+++ b/PaperPilot_项目文档.docx
@@ -39,14 +39,6 @@
         <w:pStyle w:val="Normal"/>
       </w:pPr>
       <w:r>
-        <w:t>项目成员：曹越、陈昊泽。2026 年 8 月以来的全部开发提交由陈昊泽完成。</w:t>
-      </w:r>
-    </w:p>
-    <w:p>
-      <w:pPr>
-        <w:pStyle w:val="Normal"/>
-      </w:pPr>
-      <w:r>
         <w:t>项目仓库：https://github.com/Dyotropic/PaperPilot；当前版本获取分支：develop。</w:t>
       </w:r>
     </w:p>
@@ -63,7 +55,7 @@
         <w:pStyle w:val="Normal"/>
       </w:pPr>
       <w:r>
-        <w:t>一、项目背景与目标；二、需求与业务流程；三、主要功能；四、Agent 辅助研究；五、典型使用场景；六、安装与日常使用；七、开发过程与成员分工；八、项目价值与发展方向。</w:t>
+        <w:t>一、项目背景与目标；二、需求与业务流程；三、主要功能；四、Agent 辅助研究；五、典型使用场景；六、安装与日常使用；七、成员分工；八、项目价值与发展方向。</w:t>
       </w:r>
     </w:p>
     <w:p>
@@ -1016,103 +1008,39 @@
         <w:pStyle w:val="Heading1"/>
       </w:pPr>
       <w:r>
-        <w:t>七、开发过程与成员分工</w:t>
-      </w:r>
-    </w:p>
-    <w:p>
-      <w:pPr>
-        <w:pStyle w:val="Heading2"/>
-      </w:pPr>
-      <w:r>
-        <w:t>7.1 第一阶段：建立文献检索与筛选流程</w:t>
-      </w:r>
-    </w:p>
-    <w:p>
-      <w:pPr>
-        <w:pStyle w:val="Normal"/>
-      </w:pPr>
-      <w:r>
-        <w:t>2026 年 5 月，项目围绕“输入课题后找到相关论文”的核心需求，完成课题描述、分层关键词、术语翻译、多路检索和相关性排序，建立初步文献工作流。</w:t>
-      </w:r>
-    </w:p>
-    <w:p>
-      <w:pPr>
-        <w:pStyle w:val="Normal"/>
-      </w:pPr>
-      <w:r>
-        <w:t>曹越负责界面、关键词交互和主题；陈昊泽负责数据模型、文献检索与排序、关键词提取和翻译。两人的工作共同形成项目的首阶段基础。</w:t>
-      </w:r>
-    </w:p>
-    <w:p>
-      <w:pPr>
-        <w:pStyle w:val="Heading2"/>
-      </w:pPr>
-      <w:r>
-        <w:t>7.2 第二阶段：扩展阅读、管理与 AI 辅助</w:t>
-      </w:r>
-    </w:p>
-    <w:p>
-      <w:pPr>
-        <w:pStyle w:val="Normal"/>
-      </w:pPr>
-      <w:r>
-        <w:t>项目继续扩展文献库、PDF 导入与阅读、AI 精读和评分、StudyCopilot、导出及对话保存，让检索结果进入持续阅读和研究讨论。</w:t>
-      </w:r>
-    </w:p>
-    <w:p>
-      <w:pPr>
-        <w:pStyle w:val="Normal"/>
-      </w:pPr>
-      <w:r>
-        <w:t>曹越负责原文获取、AI 服务与 Agent、PDF 导入和阅读、导出以及相关界面集成；陈昊泽负责文献库、文献管理界面和设置界面。</w:t>
-      </w:r>
-    </w:p>
-    <w:p>
-      <w:pPr>
-        <w:pStyle w:val="Heading2"/>
-      </w:pPr>
-      <w:r>
-        <w:t>7.3 2026 年 8 月以来：陈昊泽负责后续开发</w:t>
-      </w:r>
-    </w:p>
-    <w:p>
-      <w:pPr>
-        <w:pStyle w:val="Normal"/>
-      </w:pPr>
-      <w:r>
-        <w:t>自 2026 年 8 月起，项目后续开发及全部提交由陈昊泽完成，负责功能扩展、交互改进、问题修复、性能优化、验证和项目文档维护。</w:t>
-      </w:r>
-    </w:p>
-    <w:p>
-      <w:pPr>
-        <w:pStyle w:val="Normal"/>
-      </w:pPr>
-      <w:r>
-        <w:t>8 月：改进桌面页面与文献管理流程，加入 Europe PMC 和知识图谱，支持更广的资料来源与论文关系观察；完善范围勾选、原文获取、对话显示和多模型选择，并改善操作效率与稳定性。</w:t>
-      </w:r>
-    </w:p>
-    <w:p>
-      <w:pPr>
-        <w:pStyle w:val="Normal"/>
-      </w:pPr>
-      <w:r>
-        <w:t>9 月：完善年份、作者和期刊筛选，加入 DOI、arXiv ID 和完整标题精确查找；改进论文入库、阅读与排序衔接，以及 StudyCopilot 输出、模型设置和现行项目说明。</w:t>
-      </w:r>
-    </w:p>
-    <w:p>
-      <w:pPr>
-        <w:pStyle w:val="Normal"/>
-      </w:pPr>
-      <w:r>
-        <w:t>10 月：完成独立会话、停止与继续、用量和上下文管理、本地附件及科研 Agent Team；优化三源检索，接入 Gemini 和 OpenAI Responses，并调整模型接入方式；实现目标驱动长任务、动态任务清单、审批、问询、恢复和成果检查。</w:t>
-      </w:r>
-    </w:p>
-    <w:p>
-      <w:pPr>
-        <w:pStyle w:val="Normal"/>
-      </w:pPr>
-      <w:r>
-        <w:t>v2.1.0：统一界面版本显示，更新使用指南及项目说明，将文献工作流与 Agent 辅助研究完整呈现。本阶段由陈昊泽持续推进，项目从文献检索阅读工具发展为兼顾研究讨论、团队分析和持续任务执行的科研集成工作流。</w:t>
+        <w:t>七、成员分工</w:t>
+      </w:r>
+    </w:p>
+    <w:p>
+      <w:pPr>
+        <w:pStyle w:val="Heading2"/>
+      </w:pPr>
+      <w:r>
+        <w:t>7.1 曹越</w:t>
+      </w:r>
+    </w:p>
+    <w:p>
+      <w:pPr>
+        <w:pStyle w:val="Normal"/>
+      </w:pPr>
+      <w:r>
+        <w:t>曹越负责桌面界面与关键词交互、主题设计、原文获取和 PDF 导入阅读、AI 精读与评分、基础研究对话及文献导出，并完成相关功能的界面集成。</w:t>
+      </w:r>
+    </w:p>
+    <w:p>
+      <w:pPr>
+        <w:pStyle w:val="Heading2"/>
+      </w:pPr>
+      <w:r>
+        <w:t>7.2 陈昊泽</w:t>
+      </w:r>
+    </w:p>
+    <w:p>
+      <w:pPr>
+        <w:pStyle w:val="Normal"/>
+      </w:pPr>
+      <w:r>
+        <w:t>陈昊泽负责关键词提取与翻译、文献检索与筛选排序、课题文献库和设置、知识图谱与多模型接入，以及 Agent 的独立会话、资料附件、上下文与用量管理、团队协作和长任务功能；同时负责整体交互优化、性能与稳定性改进、业务验证和文档维护。</w:t>
       </w:r>
     </w:p>
     <w:p>
@@ -1196,9 +1124,6 @@
     <w:pPr>
       <w:pStyle w:val="Footer"/>
     </w:pPr>
-    <w:r>
-      <w:t xml:space="preserve">PaperPilot v2.1.0 · 项目文档  |  </w:t>
-    </w:r>
     <w:fldSimple w:instr="PAGE">
       <w:r>
         <w:t>1</w:t>
@@ -1338,7 +1263,7 @@
     </w:pPr>
     <w:rPr>
       <w:b w:val="0"/>
-      <w:sz w:val="18"/>
+      <w:sz w:val="22"/>
     </w:rPr>
   </w:style>
 </w:styles>
@@ -1470,7 +1395,7 @@
     </w:pPr>
     <w:rPr>
       <w:b w:val="0"/>
-      <w:sz w:val="18"/>
+      <w:sz w:val="22"/>
     </w:rPr>
   </w:style>
 </w:styles>

</xml_diff>